<commit_message>
Pandas md notes finalization
</commit_message>
<xml_diff>
--- a/18_PANDAS/PANDAS.docx
+++ b/18_PANDAS/PANDAS.docx
@@ -4109,86 +4109,20 @@
     <w:p>
       <w:pPr>
         <w:pStyle w:val="NoSpacing"/>
-        <w:rPr>
-          <w:lang w:val="en-GB"/>
-        </w:rPr>
-      </w:pPr>
-      <w:r>
-        <w:rPr>
-          <w:color w:val="00B050"/>
-          <w:lang w:val="en-GB"/>
-        </w:rPr>
-        <w:t xml:space="preserve">import </w:t>
-      </w:r>
-      <w:proofErr w:type="spellStart"/>
-      <w:proofErr w:type="gramStart"/>
-      <w:r>
-        <w:rPr>
-          <w:color w:val="00B050"/>
-          <w:lang w:val="en-GB"/>
-        </w:rPr>
-        <w:t>matplotlib.pyplot</w:t>
-      </w:r>
-      <w:proofErr w:type="spellEnd"/>
-      <w:proofErr w:type="gramEnd"/>
-      <w:r>
-        <w:rPr>
-          <w:color w:val="00B050"/>
-          <w:lang w:val="en-GB"/>
-        </w:rPr>
-        <w:t xml:space="preserve"> as </w:t>
-      </w:r>
-      <w:proofErr w:type="spellStart"/>
-      <w:r>
-        <w:rPr>
-          <w:color w:val="00B050"/>
-          <w:lang w:val="en-GB"/>
-        </w:rPr>
-        <w:t>plt</w:t>
-      </w:r>
-      <w:proofErr w:type="spellEnd"/>
-      <w:r>
-        <w:rPr>
-          <w:color w:val="00B050"/>
-          <w:lang w:val="en-GB"/>
-        </w:rPr>
-        <w:t xml:space="preserve"> </w:t>
-      </w:r>
-      <w:r>
-        <w:rPr>
-          <w:lang w:val="en-GB"/>
-        </w:rPr>
-        <w:t xml:space="preserve">– </w:t>
-      </w:r>
-      <w:proofErr w:type="spellStart"/>
-      <w:r>
-        <w:rPr>
-          <w:lang w:val="en-GB"/>
-        </w:rPr>
-        <w:t>biblioteka</w:t>
-      </w:r>
-      <w:proofErr w:type="spellEnd"/>
-      <w:r>
-        <w:rPr>
-          <w:lang w:val="en-GB"/>
-        </w:rPr>
-        <w:t xml:space="preserve"> do </w:t>
-      </w:r>
-      <w:proofErr w:type="spellStart"/>
-      <w:r>
-        <w:rPr>
-          <w:lang w:val="en-GB"/>
-        </w:rPr>
-        <w:t>wykresów</w:t>
-      </w:r>
-      <w:proofErr w:type="spellEnd"/>
-    </w:p>
-    <w:p>
-      <w:pPr>
-        <w:pStyle w:val="NoSpacing"/>
-        <w:rPr>
-          <w:lang w:val="en-GB"/>
-        </w:rPr>
+      </w:pPr>
+      <w:r>
+        <w:rPr>
+          <w:color w:val="00B050"/>
+        </w:rPr>
+        <w:t xml:space="preserve">import matplotlib.pyplot as plt </w:t>
+      </w:r>
+      <w:r>
+        <w:t>– biblioteka do wykresów</w:t>
+      </w:r>
+    </w:p>
+    <w:p>
+      <w:pPr>
+        <w:pStyle w:val="NoSpacing"/>
       </w:pPr>
     </w:p>
     <w:p>

</xml_diff>